<commit_message>
Mark 2nd in-depth re-review (Sep 25): 2 EN restorations — ch2 'religion scholars' (asymmetric with KO), ch16 'God's Good News' (asymmetric with KO); 5 checker candidates adjudicated as FPs; 7 MSG_SUPERSET splits declared as pure structure
</commit_message>
<xml_diff>
--- a/gdocs_build/Mark.docx
+++ b/gdocs_build/Mark.docx
@@ -2502,7 +2502,7 @@
               <w:rPr>
                 <w:sz w:val="18"/>
               </w:rPr>
-              <w:t>Levi threw a massive dinner party at his house with Jesus, his disciples, and a ton of other shady tax collectors and "sinners." Crazy as it sounds, quite a few of them had already become his followers. The Pharisees saw this and asked his disciples, "Why does he eat with outcasts?"</w:t>
+              <w:t>Levi threw a massive dinner party at his house with Jesus, his disciples, and a ton of other shady tax collectors and "sinners." Crazy as it sounds, quite a few of them had already become his followers. The religion scholars and Pharisees saw this and asked his disciples, "Why does he eat with outcasts?"</w:t>
             </w:r>
           </w:p>
         </w:tc>
@@ -33255,7 +33255,7 @@
               <w:rPr>
                 <w:sz w:val="18"/>
               </w:rPr>
-              <w:t>Still later, he appeared to the Eleven themselves while they were eating supper — and he called them out hard for their stubborn refusal to believe the people who had seen him risen. Then he said, "Go into the entire world and preach the Good News to absolutely everyone. Anyone who believes and is baptized will be saved — but anyone who refuses to believe will be condemned."</w:t>
+              <w:t>Still later, he appeared to the Eleven themselves while they were eating supper — and he called them out hard for their stubborn refusal to believe the people who had seen him risen. Then he said, "Go into the entire world and preach God's Good News to absolutely everyone. Anyone who believes and is baptized will be saved — but anyone who refuses to believe will be condemned."</w:t>
             </w:r>
           </w:p>
         </w:tc>

</xml_diff>

<commit_message>
Ephesians 배지 정밀조사: ch2 '1-6'x2 → '1-3'/'4-6' (EN+KO, MSG 대조)
</commit_message>
<xml_diff>
--- a/gdocs_build/Mark.docx
+++ b/gdocs_build/Mark.docx
@@ -10514,7 +10514,7 @@
                 <w:b/>
                 <w:sz w:val="16"/>
               </w:rPr>
-              <w:t>6-8</w:t>
+              <w:t>6</w:t>
             </w:r>
           </w:p>
           <w:p>
@@ -10545,7 +10545,7 @@
                 <w:b/>
                 <w:sz w:val="16"/>
               </w:rPr>
-              <w:t>6-8</w:t>
+              <w:t>6</w:t>
             </w:r>
           </w:p>
           <w:p>
@@ -10568,7 +10568,7 @@
                 <w:b/>
                 <w:sz w:val="16"/>
               </w:rPr>
-              <w:t>6-8</w:t>
+              <w:t>6</w:t>
             </w:r>
           </w:p>
           <w:p>
@@ -10664,7 +10664,7 @@
                 <w:b/>
                 <w:sz w:val="16"/>
               </w:rPr>
-              <w:t>9-13</w:t>
+              <w:t>9</w:t>
             </w:r>
           </w:p>
           <w:p>
@@ -10687,7 +10687,7 @@
                 <w:b/>
                 <w:sz w:val="16"/>
               </w:rPr>
-              <w:t>9-13</w:t>
+              <w:t>9</w:t>
             </w:r>
           </w:p>
           <w:p>
@@ -10710,7 +10710,7 @@
                 <w:b/>
                 <w:sz w:val="16"/>
               </w:rPr>
-              <w:t>9-13</w:t>
+              <w:t>9</w:t>
             </w:r>
           </w:p>
           <w:p>
@@ -10735,7 +10735,7 @@
                 <w:b/>
                 <w:sz w:val="16"/>
               </w:rPr>
-              <w:t>9-13</w:t>
+              <w:t>10</w:t>
             </w:r>
           </w:p>
           <w:p>
@@ -10758,7 +10758,7 @@
                 <w:b/>
                 <w:sz w:val="16"/>
               </w:rPr>
-              <w:t>9-13</w:t>
+              <w:t>10</w:t>
             </w:r>
           </w:p>
           <w:p>
@@ -10781,7 +10781,7 @@
                 <w:b/>
                 <w:sz w:val="16"/>
               </w:rPr>
-              <w:t>9-13</w:t>
+              <w:t>10</w:t>
             </w:r>
           </w:p>
           <w:p>
@@ -10806,7 +10806,7 @@
                 <w:b/>
                 <w:sz w:val="16"/>
               </w:rPr>
-              <w:t>9-13</w:t>
+              <w:t>11</w:t>
             </w:r>
           </w:p>
           <w:p>
@@ -10829,7 +10829,7 @@
                 <w:b/>
                 <w:sz w:val="16"/>
               </w:rPr>
-              <w:t>9-13</w:t>
+              <w:t>11</w:t>
             </w:r>
           </w:p>
           <w:p>
@@ -10852,7 +10852,7 @@
                 <w:b/>
                 <w:sz w:val="16"/>
               </w:rPr>
-              <w:t>9-13</w:t>
+              <w:t>11</w:t>
             </w:r>
           </w:p>
           <w:p>
@@ -10877,7 +10877,7 @@
                 <w:b/>
                 <w:sz w:val="16"/>
               </w:rPr>
-              <w:t>9-13</w:t>
+              <w:t>12-13</w:t>
             </w:r>
           </w:p>
           <w:p>
@@ -10900,7 +10900,7 @@
                 <w:b/>
                 <w:sz w:val="16"/>
               </w:rPr>
-              <w:t>9-13</w:t>
+              <w:t>12-13</w:t>
             </w:r>
           </w:p>
           <w:p>
@@ -10923,7 +10923,7 @@
                 <w:b/>
                 <w:sz w:val="16"/>
               </w:rPr>
-              <w:t>9-13</w:t>
+              <w:t>12-13</w:t>
             </w:r>
           </w:p>
           <w:p>
@@ -10948,7 +10948,7 @@
                 <w:b/>
                 <w:sz w:val="16"/>
               </w:rPr>
-              <w:t>14-15</w:t>
+              <w:t>14</w:t>
             </w:r>
           </w:p>
           <w:p>
@@ -10971,7 +10971,7 @@
                 <w:b/>
                 <w:sz w:val="16"/>
               </w:rPr>
-              <w:t>14-15</w:t>
+              <w:t>14</w:t>
             </w:r>
           </w:p>
           <w:p>
@@ -10994,7 +10994,7 @@
                 <w:b/>
                 <w:sz w:val="16"/>
               </w:rPr>
-              <w:t>14-15</w:t>
+              <w:t>14</w:t>
             </w:r>
           </w:p>
           <w:p>
@@ -11019,7 +11019,7 @@
                 <w:b/>
                 <w:sz w:val="16"/>
               </w:rPr>
-              <w:t>14-15</w:t>
+              <w:t>15</w:t>
             </w:r>
           </w:p>
           <w:p>
@@ -11042,7 +11042,7 @@
                 <w:b/>
                 <w:sz w:val="16"/>
               </w:rPr>
-              <w:t>14-15</w:t>
+              <w:t>15</w:t>
             </w:r>
           </w:p>
           <w:p>
@@ -11065,7 +11065,7 @@
                 <w:b/>
                 <w:sz w:val="16"/>
               </w:rPr>
-              <w:t>14-15</w:t>
+              <w:t>15</w:t>
             </w:r>
           </w:p>
           <w:p>
@@ -11161,7 +11161,7 @@
                 <w:b/>
                 <w:sz w:val="16"/>
               </w:rPr>
-              <w:t>18-19</w:t>
+              <w:t>18</w:t>
             </w:r>
           </w:p>
           <w:p>
@@ -11184,7 +11184,7 @@
                 <w:b/>
                 <w:sz w:val="16"/>
               </w:rPr>
-              <w:t>18-19</w:t>
+              <w:t>18</w:t>
             </w:r>
           </w:p>
           <w:p>
@@ -11207,7 +11207,7 @@
                 <w:b/>
                 <w:sz w:val="16"/>
               </w:rPr>
-              <w:t>18-19</w:t>
+              <w:t>18</w:t>
             </w:r>
           </w:p>
           <w:p>
@@ -11232,7 +11232,7 @@
                 <w:b/>
                 <w:sz w:val="16"/>
               </w:rPr>
-              <w:t>18-19</w:t>
+              <w:t>19</w:t>
             </w:r>
           </w:p>
           <w:p>
@@ -11255,7 +11255,7 @@
                 <w:b/>
                 <w:sz w:val="16"/>
               </w:rPr>
-              <w:t>18-19</w:t>
+              <w:t>19</w:t>
             </w:r>
           </w:p>
           <w:p>
@@ -11278,7 +11278,7 @@
                 <w:b/>
                 <w:sz w:val="16"/>
               </w:rPr>
-              <w:t>18-19</w:t>
+              <w:t>19</w:t>
             </w:r>
           </w:p>
           <w:p>
@@ -11374,7 +11374,7 @@
                 <w:b/>
                 <w:sz w:val="16"/>
               </w:rPr>
-              <w:t>24-26</w:t>
+              <w:t>24</w:t>
             </w:r>
           </w:p>
           <w:p>
@@ -11397,7 +11397,7 @@
                 <w:b/>
                 <w:sz w:val="16"/>
               </w:rPr>
-              <w:t>24-26</w:t>
+              <w:t>24</w:t>
             </w:r>
           </w:p>
           <w:p>
@@ -11420,7 +11420,7 @@
                 <w:b/>
                 <w:sz w:val="16"/>
               </w:rPr>
-              <w:t>24-26</w:t>
+              <w:t>24</w:t>
             </w:r>
           </w:p>
           <w:p>
@@ -11445,7 +11445,7 @@
                 <w:b/>
                 <w:sz w:val="16"/>
               </w:rPr>
-              <w:t>24-26</w:t>
+              <w:t>25</w:t>
             </w:r>
           </w:p>
           <w:p>
@@ -11468,7 +11468,7 @@
                 <w:b/>
                 <w:sz w:val="16"/>
               </w:rPr>
-              <w:t>24-26</w:t>
+              <w:t>25</w:t>
             </w:r>
           </w:p>
           <w:p>
@@ -11491,7 +11491,7 @@
                 <w:b/>
                 <w:sz w:val="16"/>
               </w:rPr>
-              <w:t>24-26</w:t>
+              <w:t>25</w:t>
             </w:r>
           </w:p>
           <w:p>
@@ -11516,7 +11516,7 @@
                 <w:b/>
                 <w:sz w:val="16"/>
               </w:rPr>
-              <w:t>24-26</w:t>
+              <w:t>26</w:t>
             </w:r>
           </w:p>
           <w:p>
@@ -11539,7 +11539,7 @@
                 <w:b/>
                 <w:sz w:val="16"/>
               </w:rPr>
-              <w:t>24-26</w:t>
+              <w:t>26</w:t>
             </w:r>
           </w:p>
           <w:p>
@@ -11562,7 +11562,7 @@
                 <w:b/>
                 <w:sz w:val="16"/>
               </w:rPr>
-              <w:t>24-26</w:t>
+              <w:t>26</w:t>
             </w:r>
           </w:p>
           <w:p>
@@ -11729,7 +11729,7 @@
                 <w:b/>
                 <w:sz w:val="16"/>
               </w:rPr>
-              <w:t>29-30</w:t>
+              <w:t>29</w:t>
             </w:r>
           </w:p>
           <w:p>
@@ -11752,7 +11752,7 @@
                 <w:b/>
                 <w:sz w:val="16"/>
               </w:rPr>
-              <w:t>29-30</w:t>
+              <w:t>29</w:t>
             </w:r>
           </w:p>
           <w:p>
@@ -11775,7 +11775,7 @@
                 <w:b/>
                 <w:sz w:val="16"/>
               </w:rPr>
-              <w:t>29-30</w:t>
+              <w:t>29</w:t>
             </w:r>
           </w:p>
           <w:p>
@@ -11800,7 +11800,7 @@
                 <w:b/>
                 <w:sz w:val="16"/>
               </w:rPr>
-              <w:t>29-30</w:t>
+              <w:t>30</w:t>
             </w:r>
           </w:p>
           <w:p>
@@ -11823,7 +11823,7 @@
                 <w:b/>
                 <w:sz w:val="16"/>
               </w:rPr>
-              <w:t>29-30</w:t>
+              <w:t>30</w:t>
             </w:r>
           </w:p>
           <w:p>
@@ -11846,7 +11846,7 @@
                 <w:b/>
                 <w:sz w:val="16"/>
               </w:rPr>
-              <w:t>29-30</w:t>
+              <w:t>30</w:t>
             </w:r>
           </w:p>
           <w:p>
@@ -11871,7 +11871,7 @@
                 <w:b/>
                 <w:sz w:val="16"/>
               </w:rPr>
-              <w:t>31-35</w:t>
+              <w:t>31</w:t>
             </w:r>
           </w:p>
           <w:p>
@@ -11894,7 +11894,7 @@
                 <w:b/>
                 <w:sz w:val="16"/>
               </w:rPr>
-              <w:t>31-35</w:t>
+              <w:t>31</w:t>
             </w:r>
           </w:p>
           <w:p>
@@ -11917,7 +11917,7 @@
                 <w:b/>
                 <w:sz w:val="16"/>
               </w:rPr>
-              <w:t>31-35</w:t>
+              <w:t>31</w:t>
             </w:r>
           </w:p>
           <w:p>
@@ -11942,7 +11942,7 @@
                 <w:b/>
                 <w:sz w:val="16"/>
               </w:rPr>
-              <w:t>31-35</w:t>
+              <w:t>32</w:t>
             </w:r>
           </w:p>
           <w:p>
@@ -11965,7 +11965,7 @@
                 <w:b/>
                 <w:sz w:val="16"/>
               </w:rPr>
-              <w:t>31-35</w:t>
+              <w:t>32</w:t>
             </w:r>
           </w:p>
           <w:p>
@@ -11988,7 +11988,7 @@
                 <w:b/>
                 <w:sz w:val="16"/>
               </w:rPr>
-              <w:t>31-35</w:t>
+              <w:t>32</w:t>
             </w:r>
           </w:p>
           <w:p>
@@ -12013,7 +12013,7 @@
                 <w:b/>
                 <w:sz w:val="16"/>
               </w:rPr>
-              <w:t>31-35</w:t>
+              <w:t>33-34</w:t>
             </w:r>
           </w:p>
           <w:p>
@@ -12036,7 +12036,7 @@
                 <w:b/>
                 <w:sz w:val="16"/>
               </w:rPr>
-              <w:t>31-35</w:t>
+              <w:t>33-34</w:t>
             </w:r>
           </w:p>
           <w:p>
@@ -12059,7 +12059,7 @@
                 <w:b/>
                 <w:sz w:val="16"/>
               </w:rPr>
-              <w:t>31-35</w:t>
+              <w:t>33-34</w:t>
             </w:r>
           </w:p>
           <w:p>
@@ -12084,7 +12084,7 @@
                 <w:b/>
                 <w:sz w:val="16"/>
               </w:rPr>
-              <w:t>31-35</w:t>
+              <w:t>35</w:t>
             </w:r>
           </w:p>
           <w:p>
@@ -12107,7 +12107,7 @@
                 <w:b/>
                 <w:sz w:val="16"/>
               </w:rPr>
-              <w:t>31-35</w:t>
+              <w:t>35</w:t>
             </w:r>
           </w:p>
           <w:p>
@@ -12130,7 +12130,7 @@
                 <w:b/>
                 <w:sz w:val="16"/>
               </w:rPr>
-              <w:t>31-35</w:t>
+              <w:t>35</w:t>
             </w:r>
           </w:p>
           <w:p>
@@ -12155,7 +12155,7 @@
                 <w:b/>
                 <w:sz w:val="16"/>
               </w:rPr>
-              <w:t>36-37</w:t>
+              <w:t>36</w:t>
             </w:r>
           </w:p>
           <w:p>
@@ -12178,7 +12178,7 @@
                 <w:b/>
                 <w:sz w:val="16"/>
               </w:rPr>
-              <w:t>36-37</w:t>
+              <w:t>36</w:t>
             </w:r>
           </w:p>
           <w:p>
@@ -12201,7 +12201,7 @@
                 <w:b/>
                 <w:sz w:val="16"/>
               </w:rPr>
-              <w:t>36-37</w:t>
+              <w:t>36</w:t>
             </w:r>
           </w:p>
           <w:p>
@@ -12226,7 +12226,7 @@
                 <w:b/>
                 <w:sz w:val="16"/>
               </w:rPr>
-              <w:t>36-37</w:t>
+              <w:t>37</w:t>
             </w:r>
           </w:p>
           <w:p>
@@ -12249,7 +12249,7 @@
                 <w:b/>
                 <w:sz w:val="16"/>
               </w:rPr>
-              <w:t>36-37</w:t>
+              <w:t>37</w:t>
             </w:r>
           </w:p>
           <w:p>
@@ -12272,7 +12272,7 @@
                 <w:b/>
                 <w:sz w:val="16"/>
               </w:rPr>
-              <w:t>36-37</w:t>
+              <w:t>37</w:t>
             </w:r>
           </w:p>
           <w:p>
@@ -16874,7 +16874,7 @@
                 <w:b/>
                 <w:sz w:val="16"/>
               </w:rPr>
-              <w:t>5-9</w:t>
+              <w:t>5-6</w:t>
             </w:r>
           </w:p>
           <w:p>
@@ -16897,7 +16897,7 @@
                 <w:b/>
                 <w:sz w:val="16"/>
               </w:rPr>
-              <w:t>5-9</w:t>
+              <w:t>5-6</w:t>
             </w:r>
           </w:p>
           <w:p>
@@ -16920,7 +16920,7 @@
                 <w:b/>
                 <w:sz w:val="16"/>
               </w:rPr>
-              <w:t>5-9</w:t>
+              <w:t>5-6</w:t>
             </w:r>
           </w:p>
           <w:p>
@@ -16945,7 +16945,7 @@
                 <w:b/>
                 <w:sz w:val="16"/>
               </w:rPr>
-              <w:t>5-9</w:t>
+              <w:t>7-8</w:t>
             </w:r>
           </w:p>
           <w:p>
@@ -16968,7 +16968,7 @@
                 <w:b/>
                 <w:sz w:val="16"/>
               </w:rPr>
-              <w:t>5-9</w:t>
+              <w:t>7-8</w:t>
             </w:r>
           </w:p>
           <w:p>
@@ -16991,7 +16991,7 @@
                 <w:b/>
                 <w:sz w:val="16"/>
               </w:rPr>
-              <w:t>5-9</w:t>
+              <w:t>7-8</w:t>
             </w:r>
           </w:p>
           <w:p>
@@ -17016,7 +17016,7 @@
                 <w:b/>
                 <w:sz w:val="16"/>
               </w:rPr>
-              <w:t>5-9</w:t>
+              <w:t>9</w:t>
             </w:r>
           </w:p>
           <w:p>
@@ -17039,7 +17039,7 @@
                 <w:b/>
                 <w:sz w:val="16"/>
               </w:rPr>
-              <w:t>5-9</w:t>
+              <w:t>9</w:t>
             </w:r>
           </w:p>
           <w:p>
@@ -17062,7 +17062,7 @@
                 <w:b/>
                 <w:sz w:val="16"/>
               </w:rPr>
-              <w:t>5-9</w:t>
+              <w:t>9</w:t>
             </w:r>
           </w:p>
           <w:p>
@@ -17229,7 +17229,7 @@
                 <w:b/>
                 <w:sz w:val="16"/>
               </w:rPr>
-              <w:t>13-16</w:t>
+              <w:t>13</w:t>
             </w:r>
           </w:p>
           <w:p>
@@ -17252,7 +17252,7 @@
                 <w:b/>
                 <w:sz w:val="16"/>
               </w:rPr>
-              <w:t>13-16</w:t>
+              <w:t>13</w:t>
             </w:r>
           </w:p>
           <w:p>
@@ -17275,7 +17275,7 @@
                 <w:b/>
                 <w:sz w:val="16"/>
               </w:rPr>
-              <w:t>13-16</w:t>
+              <w:t>13</w:t>
             </w:r>
           </w:p>
           <w:p>
@@ -17300,7 +17300,7 @@
                 <w:b/>
                 <w:sz w:val="16"/>
               </w:rPr>
-              <w:t>13-16</w:t>
+              <w:t>14</w:t>
             </w:r>
           </w:p>
           <w:p>
@@ -17323,7 +17323,7 @@
                 <w:b/>
                 <w:sz w:val="16"/>
               </w:rPr>
-              <w:t>13-16</w:t>
+              <w:t>14</w:t>
             </w:r>
           </w:p>
           <w:p>
@@ -17346,7 +17346,7 @@
                 <w:b/>
                 <w:sz w:val="16"/>
               </w:rPr>
-              <w:t>13-16</w:t>
+              <w:t>14</w:t>
             </w:r>
           </w:p>
           <w:p>
@@ -17371,7 +17371,7 @@
                 <w:b/>
                 <w:sz w:val="16"/>
               </w:rPr>
-              <w:t>13-16</w:t>
+              <w:t>15-16</w:t>
             </w:r>
           </w:p>
           <w:p>
@@ -17394,7 +17394,7 @@
                 <w:b/>
                 <w:sz w:val="16"/>
               </w:rPr>
-              <w:t>13-16</w:t>
+              <w:t>15-16</w:t>
             </w:r>
           </w:p>
           <w:p>
@@ -17417,7 +17417,7 @@
                 <w:b/>
                 <w:sz w:val="16"/>
               </w:rPr>
-              <w:t>13-16</w:t>
+              <w:t>15-16</w:t>
             </w:r>
           </w:p>
           <w:p>
@@ -17842,7 +17842,7 @@
                 <w:b/>
                 <w:sz w:val="16"/>
               </w:rPr>
-              <w:t>23-25</w:t>
+              <w:t>23</w:t>
             </w:r>
           </w:p>
           <w:p>
@@ -17865,7 +17865,7 @@
                 <w:b/>
                 <w:sz w:val="16"/>
               </w:rPr>
-              <w:t>23-25</w:t>
+              <w:t>23</w:t>
             </w:r>
           </w:p>
           <w:p>
@@ -17888,7 +17888,7 @@
                 <w:b/>
                 <w:sz w:val="16"/>
               </w:rPr>
-              <w:t>23-25</w:t>
+              <w:t>23</w:t>
             </w:r>
           </w:p>
           <w:p>
@@ -17913,7 +17913,7 @@
                 <w:b/>
                 <w:sz w:val="16"/>
               </w:rPr>
-              <w:t>23-25</w:t>
+              <w:t>24-25</w:t>
             </w:r>
           </w:p>
           <w:p>
@@ -17936,7 +17936,7 @@
                 <w:b/>
                 <w:sz w:val="16"/>
               </w:rPr>
-              <w:t>23-25</w:t>
+              <w:t>24-25</w:t>
             </w:r>
           </w:p>
           <w:p>
@@ -17959,7 +17959,7 @@
                 <w:b/>
                 <w:sz w:val="16"/>
               </w:rPr>
-              <w:t>23-25</w:t>
+              <w:t>24-25</w:t>
             </w:r>
           </w:p>
           <w:p>
@@ -18197,7 +18197,7 @@
                 <w:b/>
                 <w:sz w:val="16"/>
               </w:rPr>
-              <w:t>29-31</w:t>
+              <w:t>29</w:t>
             </w:r>
           </w:p>
           <w:p>
@@ -18220,7 +18220,7 @@
                 <w:b/>
                 <w:sz w:val="16"/>
               </w:rPr>
-              <w:t>29-31</w:t>
+              <w:t>29</w:t>
             </w:r>
           </w:p>
           <w:p>
@@ -18243,7 +18243,7 @@
                 <w:b/>
                 <w:sz w:val="16"/>
               </w:rPr>
-              <w:t>29-31</w:t>
+              <w:t>29</w:t>
             </w:r>
           </w:p>
           <w:p>
@@ -18268,7 +18268,7 @@
                 <w:b/>
                 <w:sz w:val="16"/>
               </w:rPr>
-              <w:t>29-31</w:t>
+              <w:t>30</w:t>
             </w:r>
           </w:p>
           <w:p>
@@ -18291,7 +18291,7 @@
                 <w:b/>
                 <w:sz w:val="16"/>
               </w:rPr>
-              <w:t>29-31</w:t>
+              <w:t>30</w:t>
             </w:r>
           </w:p>
           <w:p>
@@ -18314,7 +18314,7 @@
                 <w:b/>
                 <w:sz w:val="16"/>
               </w:rPr>
-              <w:t>29-31</w:t>
+              <w:t>30</w:t>
             </w:r>
           </w:p>
           <w:p>
@@ -18339,7 +18339,7 @@
                 <w:b/>
                 <w:sz w:val="16"/>
               </w:rPr>
-              <w:t>29-31</w:t>
+              <w:t>31</w:t>
             </w:r>
           </w:p>
           <w:p>
@@ -18362,7 +18362,7 @@
                 <w:b/>
                 <w:sz w:val="16"/>
               </w:rPr>
-              <w:t>29-31</w:t>
+              <w:t>31</w:t>
             </w:r>
           </w:p>
           <w:p>
@@ -18385,7 +18385,7 @@
                 <w:b/>
                 <w:sz w:val="16"/>
               </w:rPr>
-              <w:t>29-31</w:t>
+              <w:t>31</w:t>
             </w:r>
           </w:p>
           <w:p>
@@ -18410,7 +18410,7 @@
                 <w:b/>
                 <w:sz w:val="16"/>
               </w:rPr>
-              <w:t>32-34</w:t>
+              <w:t>32</w:t>
             </w:r>
           </w:p>
           <w:p>
@@ -18433,7 +18433,7 @@
                 <w:b/>
                 <w:sz w:val="16"/>
               </w:rPr>
-              <w:t>32-34</w:t>
+              <w:t>32</w:t>
             </w:r>
           </w:p>
           <w:p>
@@ -18456,7 +18456,7 @@
                 <w:b/>
                 <w:sz w:val="16"/>
               </w:rPr>
-              <w:t>32-34</w:t>
+              <w:t>32</w:t>
             </w:r>
           </w:p>
           <w:p>
@@ -18481,7 +18481,7 @@
                 <w:b/>
                 <w:sz w:val="16"/>
               </w:rPr>
-              <w:t>32-34</w:t>
+              <w:t>33</w:t>
             </w:r>
           </w:p>
           <w:p>
@@ -18504,7 +18504,7 @@
                 <w:b/>
                 <w:sz w:val="16"/>
               </w:rPr>
-              <w:t>32-34</w:t>
+              <w:t>33</w:t>
             </w:r>
           </w:p>
           <w:p>
@@ -18527,7 +18527,7 @@
                 <w:b/>
                 <w:sz w:val="16"/>
               </w:rPr>
-              <w:t>32-34</w:t>
+              <w:t>33</w:t>
             </w:r>
           </w:p>
           <w:p>
@@ -18552,7 +18552,7 @@
                 <w:b/>
                 <w:sz w:val="16"/>
               </w:rPr>
-              <w:t>32-34</w:t>
+              <w:t>34</w:t>
             </w:r>
           </w:p>
           <w:p>
@@ -18575,7 +18575,7 @@
                 <w:b/>
                 <w:sz w:val="16"/>
               </w:rPr>
-              <w:t>32-34</w:t>
+              <w:t>34</w:t>
             </w:r>
           </w:p>
           <w:p>
@@ -18598,7 +18598,7 @@
                 <w:b/>
                 <w:sz w:val="16"/>
               </w:rPr>
-              <w:t>32-34</w:t>
+              <w:t>34</w:t>
             </w:r>
           </w:p>
           <w:p>
@@ -18952,7 +18952,7 @@
                 <w:b/>
                 <w:sz w:val="16"/>
               </w:rPr>
-              <w:t>39-40</w:t>
+              <w:t>39</w:t>
             </w:r>
           </w:p>
           <w:p>
@@ -18983,7 +18983,7 @@
                 <w:b/>
                 <w:sz w:val="16"/>
               </w:rPr>
-              <w:t>39-40</w:t>
+              <w:t>39</w:t>
             </w:r>
           </w:p>
           <w:p>
@@ -19006,7 +19006,7 @@
                 <w:b/>
                 <w:sz w:val="16"/>
               </w:rPr>
-              <w:t>39-40</w:t>
+              <w:t>39</w:t>
             </w:r>
           </w:p>
           <w:p>
@@ -19386,7 +19386,7 @@
                 <w:b/>
                 <w:sz w:val="16"/>
               </w:rPr>
-              <w:t>46-48</w:t>
+              <w:t>46</w:t>
             </w:r>
           </w:p>
           <w:p>
@@ -19409,7 +19409,7 @@
                 <w:b/>
                 <w:sz w:val="16"/>
               </w:rPr>
-              <w:t>46-48</w:t>
+              <w:t>46</w:t>
             </w:r>
           </w:p>
           <w:p>
@@ -19432,7 +19432,7 @@
                 <w:b/>
                 <w:sz w:val="16"/>
               </w:rPr>
-              <w:t>46-48</w:t>
+              <w:t>46</w:t>
             </w:r>
           </w:p>
           <w:p>
@@ -19457,7 +19457,7 @@
                 <w:b/>
                 <w:sz w:val="16"/>
               </w:rPr>
-              <w:t>46-48</w:t>
+              <w:t>47</w:t>
             </w:r>
           </w:p>
           <w:p>
@@ -19480,7 +19480,7 @@
                 <w:b/>
                 <w:sz w:val="16"/>
               </w:rPr>
-              <w:t>46-48</w:t>
+              <w:t>47</w:t>
             </w:r>
           </w:p>
           <w:p>
@@ -19503,7 +19503,7 @@
                 <w:b/>
                 <w:sz w:val="16"/>
               </w:rPr>
-              <w:t>46-48</w:t>
+              <w:t>47</w:t>
             </w:r>
           </w:p>
           <w:p>
@@ -19528,7 +19528,7 @@
                 <w:b/>
                 <w:sz w:val="16"/>
               </w:rPr>
-              <w:t>46-48</w:t>
+              <w:t>48</w:t>
             </w:r>
           </w:p>
           <w:p>
@@ -19551,7 +19551,7 @@
                 <w:b/>
                 <w:sz w:val="16"/>
               </w:rPr>
-              <w:t>46-48</w:t>
+              <w:t>48</w:t>
             </w:r>
           </w:p>
           <w:p>
@@ -19574,7 +19574,7 @@
                 <w:b/>
                 <w:sz w:val="16"/>
               </w:rPr>
-              <w:t>46-48</w:t>
+              <w:t>48</w:t>
             </w:r>
           </w:p>
           <w:p>
@@ -19599,7 +19599,7 @@
                 <w:b/>
                 <w:sz w:val="16"/>
               </w:rPr>
-              <w:t>49-50</w:t>
+              <w:t>49</w:t>
             </w:r>
           </w:p>
           <w:p>
@@ -19630,7 +19630,7 @@
                 <w:b/>
                 <w:sz w:val="16"/>
               </w:rPr>
-              <w:t>49-50</w:t>
+              <w:t>49</w:t>
             </w:r>
           </w:p>
           <w:p>
@@ -19653,7 +19653,7 @@
                 <w:b/>
                 <w:sz w:val="16"/>
               </w:rPr>
-              <w:t>49-50</w:t>
+              <w:t>49</w:t>
             </w:r>
           </w:p>
           <w:p>
@@ -20090,7 +20090,7 @@
                 <w:b/>
                 <w:sz w:val="16"/>
               </w:rPr>
-              <w:t>1-3</w:t>
+              <w:t>1</w:t>
             </w:r>
           </w:p>
           <w:p>
@@ -20113,7 +20113,7 @@
                 <w:b/>
                 <w:sz w:val="16"/>
               </w:rPr>
-              <w:t>1-3</w:t>
+              <w:t>1</w:t>
             </w:r>
           </w:p>
           <w:p>
@@ -20136,7 +20136,7 @@
                 <w:b/>
                 <w:sz w:val="16"/>
               </w:rPr>
-              <w:t>1-3</w:t>
+              <w:t>1</w:t>
             </w:r>
           </w:p>
           <w:p>
@@ -20161,7 +20161,7 @@
                 <w:b/>
                 <w:sz w:val="16"/>
               </w:rPr>
-              <w:t>1-3</w:t>
+              <w:t>2</w:t>
             </w:r>
           </w:p>
           <w:p>
@@ -20184,7 +20184,7 @@
                 <w:b/>
                 <w:sz w:val="16"/>
               </w:rPr>
-              <w:t>1-3</w:t>
+              <w:t>2</w:t>
             </w:r>
           </w:p>
           <w:p>
@@ -20207,7 +20207,7 @@
                 <w:b/>
                 <w:sz w:val="16"/>
               </w:rPr>
-              <w:t>1-3</w:t>
+              <w:t>2</w:t>
             </w:r>
           </w:p>
           <w:p>
@@ -20232,7 +20232,7 @@
                 <w:b/>
                 <w:sz w:val="16"/>
               </w:rPr>
-              <w:t>1-3</w:t>
+              <w:t>3</w:t>
             </w:r>
           </w:p>
           <w:p>
@@ -20255,7 +20255,7 @@
                 <w:b/>
                 <w:sz w:val="16"/>
               </w:rPr>
-              <w:t>1-3</w:t>
+              <w:t>3</w:t>
             </w:r>
           </w:p>
           <w:p>
@@ -20278,7 +20278,7 @@
                 <w:b/>
                 <w:sz w:val="16"/>
               </w:rPr>
-              <w:t>1-3</w:t>
+              <w:t>3</w:t>
             </w:r>
           </w:p>
           <w:p>
@@ -20303,7 +20303,7 @@
                 <w:b/>
                 <w:sz w:val="16"/>
               </w:rPr>
-              <w:t>4-7</w:t>
+              <w:t>4</w:t>
             </w:r>
           </w:p>
           <w:p>
@@ -20326,7 +20326,7 @@
                 <w:b/>
                 <w:sz w:val="16"/>
               </w:rPr>
-              <w:t>4-7</w:t>
+              <w:t>4</w:t>
             </w:r>
           </w:p>
           <w:p>
@@ -20349,7 +20349,7 @@
                 <w:b/>
                 <w:sz w:val="16"/>
               </w:rPr>
-              <w:t>4-7</w:t>
+              <w:t>4</w:t>
             </w:r>
           </w:p>
           <w:p>
@@ -20374,7 +20374,7 @@
                 <w:b/>
                 <w:sz w:val="16"/>
               </w:rPr>
-              <w:t>4-7</w:t>
+              <w:t>5</w:t>
             </w:r>
           </w:p>
           <w:p>
@@ -20397,7 +20397,7 @@
                 <w:b/>
                 <w:sz w:val="16"/>
               </w:rPr>
-              <w:t>4-7</w:t>
+              <w:t>5</w:t>
             </w:r>
           </w:p>
           <w:p>
@@ -20420,7 +20420,7 @@
                 <w:b/>
                 <w:sz w:val="16"/>
               </w:rPr>
-              <w:t>4-7</w:t>
+              <w:t>5</w:t>
             </w:r>
           </w:p>
           <w:p>
@@ -20445,7 +20445,7 @@
                 <w:b/>
                 <w:sz w:val="16"/>
               </w:rPr>
-              <w:t>4-7</w:t>
+              <w:t>6-7</w:t>
             </w:r>
           </w:p>
           <w:p>
@@ -20468,7 +20468,7 @@
                 <w:b/>
                 <w:sz w:val="16"/>
               </w:rPr>
-              <w:t>4-7</w:t>
+              <w:t>6-7</w:t>
             </w:r>
           </w:p>
           <w:p>
@@ -20491,7 +20491,7 @@
                 <w:b/>
                 <w:sz w:val="16"/>
               </w:rPr>
-              <w:t>4-7</w:t>
+              <w:t>6-7</w:t>
             </w:r>
           </w:p>
           <w:p>
@@ -20516,7 +20516,7 @@
                 <w:b/>
                 <w:sz w:val="16"/>
               </w:rPr>
-              <w:t>8-10</w:t>
+              <w:t>8</w:t>
             </w:r>
           </w:p>
           <w:p>
@@ -20547,7 +20547,7 @@
                 <w:b/>
                 <w:sz w:val="16"/>
               </w:rPr>
-              <w:t>8-10</w:t>
+              <w:t>8</w:t>
             </w:r>
           </w:p>
           <w:p>
@@ -20570,7 +20570,7 @@
                 <w:b/>
                 <w:sz w:val="16"/>
               </w:rPr>
-              <w:t>8-10</w:t>
+              <w:t>8</w:t>
             </w:r>
           </w:p>
           <w:p>
@@ -20595,7 +20595,7 @@
                 <w:b/>
                 <w:sz w:val="16"/>
               </w:rPr>
-              <w:t>8-10</w:t>
+              <w:t>9</w:t>
             </w:r>
           </w:p>
           <w:p>
@@ -20618,7 +20618,7 @@
                 <w:b/>
                 <w:sz w:val="16"/>
               </w:rPr>
-              <w:t>8-10</w:t>
+              <w:t>9</w:t>
             </w:r>
           </w:p>
           <w:p>
@@ -20641,7 +20641,7 @@
                 <w:b/>
                 <w:sz w:val="16"/>
               </w:rPr>
-              <w:t>8-10</w:t>
+              <w:t>9</w:t>
             </w:r>
           </w:p>
           <w:p>
@@ -20666,7 +20666,7 @@
                 <w:b/>
                 <w:sz w:val="16"/>
               </w:rPr>
-              <w:t>8-10</w:t>
+              <w:t>9-10</w:t>
             </w:r>
           </w:p>
           <w:p>
@@ -20689,7 +20689,7 @@
                 <w:b/>
                 <w:sz w:val="16"/>
               </w:rPr>
-              <w:t>8-10</w:t>
+              <w:t>9-10</w:t>
             </w:r>
           </w:p>
           <w:p>
@@ -20712,7 +20712,7 @@
                 <w:b/>
                 <w:sz w:val="16"/>
               </w:rPr>
-              <w:t>8-10</w:t>
+              <w:t>9-10</w:t>
             </w:r>
           </w:p>
           <w:p>
@@ -20853,7 +20853,7 @@
                 <w:b/>
                 <w:sz w:val="16"/>
               </w:rPr>
-              <w:t>12-14</w:t>
+              <w:t>12-13</w:t>
             </w:r>
           </w:p>
           <w:p>
@@ -20876,7 +20876,7 @@
                 <w:b/>
                 <w:sz w:val="16"/>
               </w:rPr>
-              <w:t>12-14</w:t>
+              <w:t>12-13</w:t>
             </w:r>
           </w:p>
           <w:p>
@@ -20899,7 +20899,7 @@
                 <w:b/>
                 <w:sz w:val="16"/>
               </w:rPr>
-              <w:t>12-14</w:t>
+              <w:t>12-13</w:t>
             </w:r>
           </w:p>
           <w:p>
@@ -20924,7 +20924,7 @@
                 <w:b/>
                 <w:sz w:val="16"/>
               </w:rPr>
-              <w:t>12-14</w:t>
+              <w:t>13-14</w:t>
             </w:r>
           </w:p>
           <w:p>
@@ -20947,7 +20947,7 @@
                 <w:b/>
                 <w:sz w:val="16"/>
               </w:rPr>
-              <w:t>12-14</w:t>
+              <w:t>13-14</w:t>
             </w:r>
           </w:p>
           <w:p>
@@ -20970,7 +20970,7 @@
                 <w:b/>
                 <w:sz w:val="16"/>
               </w:rPr>
-              <w:t>12-14</w:t>
+              <w:t>13-14</w:t>
             </w:r>
           </w:p>
           <w:p>
@@ -20995,7 +20995,7 @@
                 <w:b/>
                 <w:sz w:val="16"/>
               </w:rPr>
-              <w:t>12-14</w:t>
+              <w:t>14</w:t>
             </w:r>
           </w:p>
           <w:p>
@@ -21018,7 +21018,7 @@
                 <w:b/>
                 <w:sz w:val="16"/>
               </w:rPr>
-              <w:t>12-14</w:t>
+              <w:t>14</w:t>
             </w:r>
           </w:p>
           <w:p>
@@ -21041,7 +21041,7 @@
                 <w:b/>
                 <w:sz w:val="16"/>
               </w:rPr>
-              <w:t>12-14</w:t>
+              <w:t>14</w:t>
             </w:r>
           </w:p>
           <w:p>
@@ -21066,7 +21066,7 @@
                 <w:b/>
                 <w:sz w:val="16"/>
               </w:rPr>
-              <w:t>15-17</w:t>
+              <w:t>15</w:t>
             </w:r>
           </w:p>
           <w:p>
@@ -21097,7 +21097,7 @@
                 <w:b/>
                 <w:sz w:val="16"/>
               </w:rPr>
-              <w:t>15-17</w:t>
+              <w:t>15</w:t>
             </w:r>
           </w:p>
           <w:p>
@@ -21120,7 +21120,7 @@
                 <w:b/>
                 <w:sz w:val="16"/>
               </w:rPr>
-              <w:t>15-17</w:t>
+              <w:t>15</w:t>
             </w:r>
           </w:p>
           <w:p>
@@ -21145,7 +21145,7 @@
                 <w:b/>
                 <w:sz w:val="16"/>
               </w:rPr>
-              <w:t>15-17</w:t>
+              <w:t>16-17</w:t>
             </w:r>
           </w:p>
           <w:p>
@@ -21168,7 +21168,7 @@
                 <w:b/>
                 <w:sz w:val="16"/>
               </w:rPr>
-              <w:t>15-17</w:t>
+              <w:t>16-17</w:t>
             </w:r>
           </w:p>
           <w:p>
@@ -21191,7 +21191,7 @@
                 <w:b/>
                 <w:sz w:val="16"/>
               </w:rPr>
-              <w:t>15-17</w:t>
+              <w:t>16-17</w:t>
             </w:r>
           </w:p>
           <w:p>
@@ -21216,7 +21216,7 @@
                 <w:b/>
                 <w:sz w:val="16"/>
               </w:rPr>
-              <w:t>15-17</w:t>
+              <w:t>17</w:t>
             </w:r>
           </w:p>
           <w:p>
@@ -21239,7 +21239,7 @@
                 <w:b/>
                 <w:sz w:val="16"/>
               </w:rPr>
-              <w:t>15-17</w:t>
+              <w:t>17</w:t>
             </w:r>
           </w:p>
           <w:p>
@@ -21262,7 +21262,7 @@
                 <w:b/>
                 <w:sz w:val="16"/>
               </w:rPr>
-              <w:t>15-17</w:t>
+              <w:t>17</w:t>
             </w:r>
           </w:p>
           <w:p>
@@ -21429,7 +21429,7 @@
                 <w:b/>
                 <w:sz w:val="16"/>
               </w:rPr>
-              <w:t>20-21</w:t>
+              <w:t>20</w:t>
             </w:r>
           </w:p>
           <w:p>
@@ -21452,7 +21452,7 @@
                 <w:b/>
                 <w:sz w:val="16"/>
               </w:rPr>
-              <w:t>20-21</w:t>
+              <w:t>20</w:t>
             </w:r>
           </w:p>
           <w:p>
@@ -21475,7 +21475,7 @@
                 <w:b/>
                 <w:sz w:val="16"/>
               </w:rPr>
-              <w:t>20-21</w:t>
+              <w:t>20</w:t>
             </w:r>
           </w:p>
           <w:p>
@@ -21500,7 +21500,7 @@
                 <w:b/>
                 <w:sz w:val="16"/>
               </w:rPr>
-              <w:t>20-21</w:t>
+              <w:t>21</w:t>
             </w:r>
           </w:p>
           <w:p>
@@ -21523,7 +21523,7 @@
                 <w:b/>
                 <w:sz w:val="16"/>
               </w:rPr>
-              <w:t>20-21</w:t>
+              <w:t>21</w:t>
             </w:r>
           </w:p>
           <w:p>
@@ -21546,7 +21546,7 @@
                 <w:b/>
                 <w:sz w:val="16"/>
               </w:rPr>
-              <w:t>20-21</w:t>
+              <w:t>21</w:t>
             </w:r>
           </w:p>
           <w:p>
@@ -21971,7 +21971,7 @@
                 <w:b/>
                 <w:sz w:val="16"/>
               </w:rPr>
-              <w:t>31-33</w:t>
+              <w:t>31</w:t>
             </w:r>
           </w:p>
           <w:p>
@@ -22002,7 +22002,7 @@
                 <w:b/>
                 <w:sz w:val="16"/>
               </w:rPr>
-              <w:t>31-33</w:t>
+              <w:t>31</w:t>
             </w:r>
           </w:p>
           <w:p>
@@ -22025,7 +22025,7 @@
                 <w:b/>
                 <w:sz w:val="16"/>
               </w:rPr>
-              <w:t>31-33</w:t>
+              <w:t>31</w:t>
             </w:r>
           </w:p>
           <w:p>
@@ -22050,7 +22050,7 @@
                 <w:b/>
                 <w:sz w:val="16"/>
               </w:rPr>
-              <w:t>31-33</w:t>
+              <w:t>32</w:t>
             </w:r>
           </w:p>
           <w:p>
@@ -22073,7 +22073,7 @@
                 <w:b/>
                 <w:sz w:val="16"/>
               </w:rPr>
-              <w:t>31-33</w:t>
+              <w:t>32</w:t>
             </w:r>
           </w:p>
           <w:p>
@@ -22096,7 +22096,7 @@
                 <w:b/>
                 <w:sz w:val="16"/>
               </w:rPr>
-              <w:t>31-33</w:t>
+              <w:t>32</w:t>
             </w:r>
           </w:p>
           <w:p>
@@ -22121,7 +22121,7 @@
                 <w:b/>
                 <w:sz w:val="16"/>
               </w:rPr>
-              <w:t>31-33</w:t>
+              <w:t>33</w:t>
             </w:r>
           </w:p>
           <w:p>
@@ -22144,7 +22144,7 @@
                 <w:b/>
                 <w:sz w:val="16"/>
               </w:rPr>
-              <w:t>31-33</w:t>
+              <w:t>33</w:t>
             </w:r>
           </w:p>
           <w:p>
@@ -22167,7 +22167,7 @@
                 <w:b/>
                 <w:sz w:val="16"/>
               </w:rPr>
-              <w:t>31-33</w:t>
+              <w:t>33</w:t>
             </w:r>
           </w:p>
           <w:p>
@@ -23278,7 +23278,7 @@
                 <w:b/>
                 <w:sz w:val="16"/>
               </w:rPr>
-              <w:t>18-23</w:t>
+              <w:t>18-22</w:t>
             </w:r>
           </w:p>
           <w:p>
@@ -23301,7 +23301,7 @@
                 <w:b/>
                 <w:sz w:val="16"/>
               </w:rPr>
-              <w:t>18-23</w:t>
+              <w:t>18-22</w:t>
             </w:r>
           </w:p>
           <w:p>
@@ -23324,7 +23324,7 @@
                 <w:b/>
                 <w:sz w:val="16"/>
               </w:rPr>
-              <w:t>18-23</w:t>
+              <w:t>18-22</w:t>
             </w:r>
           </w:p>
           <w:p>
@@ -23349,7 +23349,7 @@
                 <w:b/>
                 <w:sz w:val="16"/>
               </w:rPr>
-              <w:t>18-23</w:t>
+              <w:t>23</w:t>
             </w:r>
           </w:p>
           <w:p>
@@ -23372,7 +23372,7 @@
                 <w:b/>
                 <w:sz w:val="16"/>
               </w:rPr>
-              <w:t>18-23</w:t>
+              <w:t>23</w:t>
             </w:r>
           </w:p>
           <w:p>
@@ -23395,7 +23395,7 @@
                 <w:b/>
                 <w:sz w:val="16"/>
               </w:rPr>
-              <w:t>18-23</w:t>
+              <w:t>23</w:t>
             </w:r>
           </w:p>
           <w:p>
@@ -23420,7 +23420,7 @@
                 <w:b/>
                 <w:sz w:val="16"/>
               </w:rPr>
-              <w:t>24-27</w:t>
+              <w:t>24-25</w:t>
             </w:r>
           </w:p>
           <w:p>
@@ -23443,7 +23443,7 @@
                 <w:b/>
                 <w:sz w:val="16"/>
               </w:rPr>
-              <w:t>24-27</w:t>
+              <w:t>24-25</w:t>
             </w:r>
           </w:p>
           <w:p>
@@ -23466,7 +23466,7 @@
                 <w:b/>
                 <w:sz w:val="16"/>
               </w:rPr>
-              <w:t>24-27</w:t>
+              <w:t>24-25</w:t>
             </w:r>
           </w:p>
           <w:p>
@@ -23491,7 +23491,7 @@
                 <w:b/>
                 <w:sz w:val="16"/>
               </w:rPr>
-              <w:t>24-27</w:t>
+              <w:t>26-27</w:t>
             </w:r>
           </w:p>
           <w:p>
@@ -23514,7 +23514,7 @@
                 <w:b/>
                 <w:sz w:val="16"/>
               </w:rPr>
-              <w:t>24-27</w:t>
+              <w:t>26-27</w:t>
             </w:r>
           </w:p>
           <w:p>
@@ -23537,7 +23537,7 @@
                 <w:b/>
                 <w:sz w:val="16"/>
               </w:rPr>
-              <w:t>24-27</w:t>
+              <w:t>26-27</w:t>
             </w:r>
           </w:p>
           <w:p>
@@ -23899,7 +23899,7 @@
                 <w:b/>
                 <w:sz w:val="16"/>
               </w:rPr>
-              <w:t>35-37</w:t>
+              <w:t>35</w:t>
             </w:r>
           </w:p>
           <w:p>
@@ -23946,7 +23946,7 @@
                 <w:b/>
                 <w:sz w:val="16"/>
               </w:rPr>
-              <w:t>35-37</w:t>
+              <w:t>35</w:t>
             </w:r>
           </w:p>
           <w:p>
@@ -23969,7 +23969,7 @@
                 <w:b/>
                 <w:sz w:val="16"/>
               </w:rPr>
-              <w:t>35-37</w:t>
+              <w:t>35</w:t>
             </w:r>
           </w:p>
           <w:p>
@@ -23994,7 +23994,7 @@
                 <w:b/>
                 <w:sz w:val="16"/>
               </w:rPr>
-              <w:t>35-37</w:t>
+              <w:t>36</w:t>
             </w:r>
           </w:p>
           <w:p>
@@ -24017,7 +24017,7 @@
                 <w:b/>
                 <w:sz w:val="16"/>
               </w:rPr>
-              <w:t>35-37</w:t>
+              <w:t>36</w:t>
             </w:r>
           </w:p>
           <w:p>
@@ -24040,7 +24040,7 @@
                 <w:b/>
                 <w:sz w:val="16"/>
               </w:rPr>
-              <w:t>35-37</w:t>
+              <w:t>36</w:t>
             </w:r>
           </w:p>
           <w:p>
@@ -24065,7 +24065,7 @@
                 <w:b/>
                 <w:sz w:val="16"/>
               </w:rPr>
-              <w:t>35-37</w:t>
+              <w:t>37</w:t>
             </w:r>
           </w:p>
           <w:p>
@@ -24088,7 +24088,7 @@
                 <w:b/>
                 <w:sz w:val="16"/>
               </w:rPr>
-              <w:t>35-37</w:t>
+              <w:t>37</w:t>
             </w:r>
           </w:p>
           <w:p>
@@ -24111,7 +24111,7 @@
                 <w:b/>
                 <w:sz w:val="16"/>
               </w:rPr>
-              <w:t>35-37</w:t>
+              <w:t>37</w:t>
             </w:r>
           </w:p>
           <w:p>
@@ -25437,7 +25437,7 @@
                 <w:b/>
                 <w:sz w:val="16"/>
               </w:rPr>
-              <w:t>15</w:t>
+              <w:t>15-17</w:t>
             </w:r>
           </w:p>
           <w:p>
@@ -25460,7 +25460,7 @@
                 <w:b/>
                 <w:sz w:val="16"/>
               </w:rPr>
-              <w:t>15</w:t>
+              <w:t>15-17</w:t>
             </w:r>
           </w:p>
           <w:p>
@@ -25483,7 +25483,7 @@
                 <w:b/>
                 <w:sz w:val="16"/>
               </w:rPr>
-              <w:t>15</w:t>
+              <w:t>15-17</w:t>
             </w:r>
           </w:p>
           <w:p>
@@ -25508,7 +25508,7 @@
                 <w:b/>
                 <w:sz w:val="16"/>
               </w:rPr>
-              <w:t>16-17</w:t>
+              <w:t>18</w:t>
             </w:r>
           </w:p>
           <w:p>
@@ -25531,7 +25531,7 @@
                 <w:b/>
                 <w:sz w:val="16"/>
               </w:rPr>
-              <w:t>16-17</w:t>
+              <w:t>18</w:t>
             </w:r>
           </w:p>
           <w:p>
@@ -25554,7 +25554,7 @@
                 <w:b/>
                 <w:sz w:val="16"/>
               </w:rPr>
-              <w:t>16-17</w:t>
+              <w:t>18</w:t>
             </w:r>
           </w:p>
           <w:p>
@@ -25579,7 +25579,7 @@
                 <w:b/>
                 <w:sz w:val="16"/>
               </w:rPr>
-              <w:t>19-20</w:t>
+              <w:t>19</w:t>
             </w:r>
           </w:p>
           <w:p>
@@ -25602,7 +25602,7 @@
                 <w:b/>
                 <w:sz w:val="16"/>
               </w:rPr>
-              <w:t>19-20</w:t>
+              <w:t>19</w:t>
             </w:r>
           </w:p>
           <w:p>
@@ -25625,7 +25625,7 @@
                 <w:b/>
                 <w:sz w:val="16"/>
               </w:rPr>
-              <w:t>19-20</w:t>
+              <w:t>19</w:t>
             </w:r>
           </w:p>
           <w:p>
@@ -25650,7 +25650,7 @@
                 <w:b/>
                 <w:sz w:val="16"/>
               </w:rPr>
-              <w:t>19-20</w:t>
+              <w:t>20</w:t>
             </w:r>
           </w:p>
           <w:p>
@@ -25673,7 +25673,7 @@
                 <w:b/>
                 <w:sz w:val="16"/>
               </w:rPr>
-              <w:t>19-20</w:t>
+              <w:t>20</w:t>
             </w:r>
           </w:p>
           <w:p>
@@ -25696,7 +25696,7 @@
                 <w:b/>
                 <w:sz w:val="16"/>
               </w:rPr>
-              <w:t>19-20</w:t>
+              <w:t>20</w:t>
             </w:r>
           </w:p>
           <w:p>
@@ -26809,7 +26809,7 @@
                 <w:b/>
                 <w:sz w:val="16"/>
               </w:rPr>
-              <w:t>3-5</w:t>
+              <w:t>3-4</w:t>
             </w:r>
           </w:p>
           <w:p>
@@ -26832,7 +26832,7 @@
                 <w:b/>
                 <w:sz w:val="16"/>
               </w:rPr>
-              <w:t>3-5</w:t>
+              <w:t>3-4</w:t>
             </w:r>
           </w:p>
           <w:p>
@@ -26855,7 +26855,7 @@
                 <w:b/>
                 <w:sz w:val="16"/>
               </w:rPr>
-              <w:t>3-5</w:t>
+              <w:t>3-4</w:t>
             </w:r>
           </w:p>
           <w:p>
@@ -29835,7 +29835,7 @@
                 <w:b/>
                 <w:sz w:val="16"/>
               </w:rPr>
-              <w:t>57-58</w:t>
+              <w:t>57-59</w:t>
             </w:r>
           </w:p>
           <w:p>
@@ -29858,7 +29858,7 @@
                 <w:b/>
                 <w:sz w:val="16"/>
               </w:rPr>
-              <w:t>57-58</w:t>
+              <w:t>57-59</w:t>
             </w:r>
           </w:p>
           <w:p>
@@ -29881,7 +29881,7 @@
                 <w:b/>
                 <w:sz w:val="16"/>
               </w:rPr>
-              <w:t>57-58</w:t>
+              <w:t>57-59</w:t>
             </w:r>
           </w:p>
           <w:p>

</xml_diff>